<commit_message>
Add complete synthetic questionnaire evidence trial
</commit_message>
<xml_diff>
--- a/sample/evidence/A-05-anti-bribery-and-whistleblowing-policy-2025.docx
+++ b/sample/evidence/A-05-anti-bribery-and-whistleblowing-policy-2025.docx
@@ -84,12 +84,12 @@
     </w:p>
     <w:p>
       <w:r>
-        <w:t>All employees complete anti-bribery and anti-corruption training within 30 days of joining and refresh it every two years.</w:t>
+        <w:t>In FY2025, 254 of 268 employees completed the training, which is 94.8 per cent. The remaining 14 joined in December 2025 and are scheduled for the January 2026 intake.</w:t>
       </w:r>
     </w:p>
     <w:p>
       <w:r>
-        <w:t>In FY2025, 254 of 268 employees completed the training, which is 94.8 per cent. The remaining 14 joined in December 2025 and are scheduled for the January 2026 intake.</w:t>
+        <w:t>All employees complete anti-bribery and anti-corruption training within 30 days of joining and refresh it every two years.</w:t>
       </w:r>
     </w:p>
     <w:p>

</xml_diff>